<commit_message>
Added insights and visualization
</commit_message>
<xml_diff>
--- a/doc/Analysis and Insights.docx
+++ b/doc/Analysis and Insights.docx
@@ -1530,6 +1530,1196 @@
           <w:rFonts w:ascii="Times New Roman" w:eastAsia="Aptos" w:hAnsi="Times New Roman" w:cs="Times New Roman"/>
         </w:rPr>
         <w:t>By investing across multiple sectors, losses in one area are balanced by gains in another.</w:t>
+      </w:r>
+    </w:p>
+    <w:p>
+      <w:r>
+        <w:t>Second Analysis performed is to identify clearly how one sector affects the other.</w:t>
+      </w:r>
+    </w:p>
+    <w:p>
+      <w:r>
+        <w:t>For understanding the relation have taken one high valued ticker (high close*volume value) from each sector.</w:t>
+      </w:r>
+    </w:p>
+    <w:p>
+      <w:r>
+        <w:t>High valued tickers from each sector are:</w:t>
+      </w:r>
+    </w:p>
+    <w:tbl>
+      <w:tblPr>
+        <w:tblStyle w:val="TableGrid"/>
+        <w:tblW w:w="0" w:type="auto"/>
+        <w:tblLook w:val="04A0" w:firstRow="1" w:lastRow="0" w:firstColumn="1" w:lastColumn="0" w:noHBand="0" w:noVBand="1"/>
+      </w:tblPr>
+      <w:tblGrid>
+        <w:gridCol w:w="4508"/>
+        <w:gridCol w:w="4508"/>
+      </w:tblGrid>
+      <w:tr>
+        <w:tc>
+          <w:tcPr>
+            <w:tcW w:w="4508" w:type="dxa"/>
+            <w:shd w:val="clear" w:color="auto" w:fill="F6C5AC" w:themeFill="accent2" w:themeFillTint="66"/>
+          </w:tcPr>
+          <w:p>
+            <w:r>
+              <w:t>Ticker</w:t>
+            </w:r>
+          </w:p>
+        </w:tc>
+        <w:tc>
+          <w:tcPr>
+            <w:tcW w:w="4508" w:type="dxa"/>
+            <w:shd w:val="clear" w:color="auto" w:fill="F6C5AC" w:themeFill="accent2" w:themeFillTint="66"/>
+          </w:tcPr>
+          <w:p>
+            <w:r>
+              <w:t>Sector</w:t>
+            </w:r>
+          </w:p>
+        </w:tc>
+      </w:tr>
+      <w:tr>
+        <w:tc>
+          <w:tcPr>
+            <w:tcW w:w="4508" w:type="dxa"/>
+          </w:tcPr>
+          <w:p>
+            <w:r>
+              <w:t xml:space="preserve">ABX.TO  </w:t>
+            </w:r>
+          </w:p>
+        </w:tc>
+        <w:tc>
+          <w:tcPr>
+            <w:tcW w:w="4508" w:type="dxa"/>
+          </w:tcPr>
+          <w:p>
+            <w:r>
+              <w:t>Basic Materials</w:t>
+            </w:r>
+          </w:p>
+        </w:tc>
+      </w:tr>
+      <w:tr>
+        <w:tc>
+          <w:tcPr>
+            <w:tcW w:w="4508" w:type="dxa"/>
+          </w:tcPr>
+          <w:p>
+            <w:r>
+              <w:t xml:space="preserve">BCE.TO  </w:t>
+            </w:r>
+          </w:p>
+        </w:tc>
+        <w:tc>
+          <w:tcPr>
+            <w:tcW w:w="4508" w:type="dxa"/>
+          </w:tcPr>
+          <w:p>
+            <w:r>
+              <w:t>Communication Services</w:t>
+            </w:r>
+          </w:p>
+        </w:tc>
+      </w:tr>
+      <w:tr>
+        <w:tc>
+          <w:tcPr>
+            <w:tcW w:w="4508" w:type="dxa"/>
+          </w:tcPr>
+          <w:p>
+            <w:r>
+              <w:t>ATD</w:t>
+            </w:r>
+            <w:r>
+              <w:t xml:space="preserve">.TO  </w:t>
+            </w:r>
+          </w:p>
+        </w:tc>
+        <w:tc>
+          <w:tcPr>
+            <w:tcW w:w="4508" w:type="dxa"/>
+          </w:tcPr>
+          <w:p>
+            <w:r>
+              <w:t>Consumer Cyclical</w:t>
+            </w:r>
+          </w:p>
+        </w:tc>
+      </w:tr>
+      <w:tr>
+        <w:tc>
+          <w:tcPr>
+            <w:tcW w:w="4508" w:type="dxa"/>
+          </w:tcPr>
+          <w:p>
+            <w:r>
+              <w:t xml:space="preserve">DOL.TO  </w:t>
+            </w:r>
+          </w:p>
+        </w:tc>
+        <w:tc>
+          <w:tcPr>
+            <w:tcW w:w="4508" w:type="dxa"/>
+          </w:tcPr>
+          <w:p>
+            <w:r>
+              <w:t>Consumer Defensive</w:t>
+            </w:r>
+          </w:p>
+        </w:tc>
+      </w:tr>
+      <w:tr>
+        <w:tc>
+          <w:tcPr>
+            <w:tcW w:w="4508" w:type="dxa"/>
+          </w:tcPr>
+          <w:p>
+            <w:r>
+              <w:t xml:space="preserve">CNQ.TO  </w:t>
+            </w:r>
+          </w:p>
+        </w:tc>
+        <w:tc>
+          <w:tcPr>
+            <w:tcW w:w="4508" w:type="dxa"/>
+          </w:tcPr>
+          <w:p>
+            <w:r>
+              <w:t>Energy</w:t>
+            </w:r>
+          </w:p>
+        </w:tc>
+      </w:tr>
+      <w:tr>
+        <w:tc>
+          <w:tcPr>
+            <w:tcW w:w="4508" w:type="dxa"/>
+          </w:tcPr>
+          <w:p>
+            <w:r>
+              <w:t xml:space="preserve">BMO.TO  </w:t>
+            </w:r>
+          </w:p>
+        </w:tc>
+        <w:tc>
+          <w:tcPr>
+            <w:tcW w:w="4508" w:type="dxa"/>
+          </w:tcPr>
+          <w:p>
+            <w:r>
+              <w:t>Financial Services</w:t>
+            </w:r>
+          </w:p>
+        </w:tc>
+      </w:tr>
+      <w:tr>
+        <w:tc>
+          <w:tcPr>
+            <w:tcW w:w="4508" w:type="dxa"/>
+          </w:tcPr>
+          <w:p>
+            <w:r>
+              <w:t xml:space="preserve">BHC.TO  </w:t>
+            </w:r>
+          </w:p>
+        </w:tc>
+        <w:tc>
+          <w:tcPr>
+            <w:tcW w:w="4508" w:type="dxa"/>
+          </w:tcPr>
+          <w:p>
+            <w:r>
+              <w:t>Healthcare</w:t>
+            </w:r>
+          </w:p>
+        </w:tc>
+      </w:tr>
+      <w:tr>
+        <w:tc>
+          <w:tcPr>
+            <w:tcW w:w="4508" w:type="dxa"/>
+          </w:tcPr>
+          <w:p>
+            <w:r>
+              <w:t xml:space="preserve">CNR.TO  </w:t>
+            </w:r>
+          </w:p>
+        </w:tc>
+        <w:tc>
+          <w:tcPr>
+            <w:tcW w:w="4508" w:type="dxa"/>
+          </w:tcPr>
+          <w:p>
+            <w:r>
+              <w:t>Industrials</w:t>
+            </w:r>
+          </w:p>
+        </w:tc>
+      </w:tr>
+      <w:tr>
+        <w:tc>
+          <w:tcPr>
+            <w:tcW w:w="4508" w:type="dxa"/>
+          </w:tcPr>
+          <w:p>
+            <w:r>
+              <w:t xml:space="preserve">CIGI.TO  </w:t>
+            </w:r>
+          </w:p>
+        </w:tc>
+        <w:tc>
+          <w:tcPr>
+            <w:tcW w:w="4508" w:type="dxa"/>
+          </w:tcPr>
+          <w:p>
+            <w:r>
+              <w:t>Real Estate</w:t>
+            </w:r>
+          </w:p>
+        </w:tc>
+      </w:tr>
+      <w:tr>
+        <w:tc>
+          <w:tcPr>
+            <w:tcW w:w="4508" w:type="dxa"/>
+          </w:tcPr>
+          <w:p>
+            <w:r>
+              <w:t xml:space="preserve">BB.TO  </w:t>
+            </w:r>
+          </w:p>
+        </w:tc>
+        <w:tc>
+          <w:tcPr>
+            <w:tcW w:w="4508" w:type="dxa"/>
+          </w:tcPr>
+          <w:p>
+            <w:r>
+              <w:t>Technology</w:t>
+            </w:r>
+          </w:p>
+        </w:tc>
+      </w:tr>
+      <w:tr>
+        <w:tc>
+          <w:tcPr>
+            <w:tcW w:w="4508" w:type="dxa"/>
+          </w:tcPr>
+          <w:p>
+            <w:r>
+              <w:t xml:space="preserve">AQN.TO  </w:t>
+            </w:r>
+          </w:p>
+        </w:tc>
+        <w:tc>
+          <w:tcPr>
+            <w:tcW w:w="4508" w:type="dxa"/>
+          </w:tcPr>
+          <w:p>
+            <w:r>
+              <w:t>Utilities</w:t>
+            </w:r>
+          </w:p>
+        </w:tc>
+      </w:tr>
+    </w:tbl>
+    <w:p/>
+    <w:p>
+      <w:r>
+        <w:lastRenderedPageBreak/>
+        <w:t>Graph</w:t>
+      </w:r>
+      <w:r>
+        <w:br/>
+      </w:r>
+      <w:r>
+        <w:rPr>
+          <w:noProof/>
+        </w:rPr>
+        <w:drawing>
+          <wp:inline distT="0" distB="0" distL="0" distR="0" wp14:anchorId="0FF88F70" wp14:editId="5E54DBD6">
+            <wp:extent cx="5724524" cy="3810000"/>
+            <wp:effectExtent l="0" t="0" r="0" b="0"/>
+            <wp:docPr id="676454181" name="Picture 676454181" descr="A graph of different colored lines&#10;&#10;Description automatically generated"/>
+            <wp:cNvGraphicFramePr>
+              <a:graphicFrameLocks xmlns:a="http://schemas.openxmlformats.org/drawingml/2006/main" noChangeAspect="1"/>
+            </wp:cNvGraphicFramePr>
+            <a:graphic xmlns:a="http://schemas.openxmlformats.org/drawingml/2006/main">
+              <a:graphicData uri="http://schemas.openxmlformats.org/drawingml/2006/picture">
+                <pic:pic xmlns:pic="http://schemas.openxmlformats.org/drawingml/2006/picture">
+                  <pic:nvPicPr>
+                    <pic:cNvPr id="676454181" name="Picture 676454181" descr="A graph of different colored lines&#10;&#10;Description automatically generated"/>
+                    <pic:cNvPicPr/>
+                  </pic:nvPicPr>
+                  <pic:blipFill>
+                    <a:blip r:embed="rId7">
+                      <a:extLst>
+                        <a:ext uri="{28A0092B-C50C-407E-A947-70E740481C1C}">
+                          <a14:useLocalDpi xmlns:a14="http://schemas.microsoft.com/office/drawing/2010/main" val="0"/>
+                        </a:ext>
+                      </a:extLst>
+                    </a:blip>
+                    <a:stretch>
+                      <a:fillRect/>
+                    </a:stretch>
+                  </pic:blipFill>
+                  <pic:spPr>
+                    <a:xfrm>
+                      <a:off x="0" y="0"/>
+                      <a:ext cx="5724524" cy="3810000"/>
+                    </a:xfrm>
+                    <a:prstGeom prst="rect">
+                      <a:avLst/>
+                    </a:prstGeom>
+                  </pic:spPr>
+                </pic:pic>
+              </a:graphicData>
+            </a:graphic>
+          </wp:inline>
+        </w:drawing>
+      </w:r>
+    </w:p>
+    <w:p>
+      <w:r>
+        <w:rPr>
+          <w:noProof/>
+        </w:rPr>
+        <w:drawing>
+          <wp:inline distT="0" distB="0" distL="0" distR="0" wp14:anchorId="13CC7A56" wp14:editId="78828D4F">
+            <wp:extent cx="5724524" cy="3810000"/>
+            <wp:effectExtent l="0" t="0" r="0" b="0"/>
+            <wp:docPr id="2038671610" name="Picture 2038671610" descr="A graph of different colored lines&#10;&#10;Description automatically generated"/>
+            <wp:cNvGraphicFramePr>
+              <a:graphicFrameLocks xmlns:a="http://schemas.openxmlformats.org/drawingml/2006/main" noChangeAspect="1"/>
+            </wp:cNvGraphicFramePr>
+            <a:graphic xmlns:a="http://schemas.openxmlformats.org/drawingml/2006/main">
+              <a:graphicData uri="http://schemas.openxmlformats.org/drawingml/2006/picture">
+                <pic:pic xmlns:pic="http://schemas.openxmlformats.org/drawingml/2006/picture">
+                  <pic:nvPicPr>
+                    <pic:cNvPr id="2038671610" name="Picture 2038671610" descr="A graph of different colored lines&#10;&#10;Description automatically generated"/>
+                    <pic:cNvPicPr/>
+                  </pic:nvPicPr>
+                  <pic:blipFill>
+                    <a:blip r:embed="rId8">
+                      <a:extLst>
+                        <a:ext uri="{28A0092B-C50C-407E-A947-70E740481C1C}">
+                          <a14:useLocalDpi xmlns:a14="http://schemas.microsoft.com/office/drawing/2010/main" val="0"/>
+                        </a:ext>
+                      </a:extLst>
+                    </a:blip>
+                    <a:stretch>
+                      <a:fillRect/>
+                    </a:stretch>
+                  </pic:blipFill>
+                  <pic:spPr>
+                    <a:xfrm>
+                      <a:off x="0" y="0"/>
+                      <a:ext cx="5724524" cy="3810000"/>
+                    </a:xfrm>
+                    <a:prstGeom prst="rect">
+                      <a:avLst/>
+                    </a:prstGeom>
+                  </pic:spPr>
+                </pic:pic>
+              </a:graphicData>
+            </a:graphic>
+          </wp:inline>
+        </w:drawing>
+      </w:r>
+    </w:p>
+    <w:p>
+      <w:r>
+        <w:t>Observations:</w:t>
+      </w:r>
+    </w:p>
+    <w:p>
+      <w:pPr>
+        <w:pStyle w:val="ListParagraph"/>
+        <w:numPr>
+          <w:ilvl w:val="0"/>
+          <w:numId w:val="16"/>
+        </w:numPr>
+      </w:pPr>
+      <w:r>
+        <w:t>Impact of Economic Events</w:t>
+      </w:r>
+    </w:p>
+    <w:p>
+      <w:pPr>
+        <w:numPr>
+          <w:ilvl w:val="0"/>
+          <w:numId w:val="15"/>
+        </w:numPr>
+        <w:tabs>
+          <w:tab w:val="num" w:pos="720"/>
+        </w:tabs>
+      </w:pPr>
+      <w:r>
+        <w:lastRenderedPageBreak/>
+        <w:t>Economic downturns (e.g., 2008 and 2020) are visible as dips in most stock trends, particularly cyclical sectors (e.g., energy and financials).</w:t>
+      </w:r>
+    </w:p>
+    <w:p>
+      <w:pPr>
+        <w:numPr>
+          <w:ilvl w:val="1"/>
+          <w:numId w:val="15"/>
+        </w:numPr>
+        <w:tabs>
+          <w:tab w:val="num" w:pos="1440"/>
+        </w:tabs>
+      </w:pPr>
+      <w:r>
+        <w:rPr>
+          <w:b/>
+          <w:bCs/>
+        </w:rPr>
+        <w:t>Insight</w:t>
+      </w:r>
+      <w:r>
+        <w:t>: Defensive sectors (like utilities) maintain stability even during crises.</w:t>
+      </w:r>
+    </w:p>
+    <w:p>
+      <w:pPr>
+        <w:numPr>
+          <w:ilvl w:val="1"/>
+          <w:numId w:val="15"/>
+        </w:numPr>
+        <w:tabs>
+          <w:tab w:val="num" w:pos="1440"/>
+        </w:tabs>
+      </w:pPr>
+      <w:r>
+        <w:rPr>
+          <w:b/>
+          <w:bCs/>
+        </w:rPr>
+        <w:t>Customer Guidance</w:t>
+      </w:r>
+      <w:r>
+        <w:t>: Recommend sector rotation into defensive sectors during periods of economic uncertainty.</w:t>
+      </w:r>
+    </w:p>
+    <w:p>
+      <w:pPr>
+        <w:pStyle w:val="ListParagraph"/>
+        <w:numPr>
+          <w:ilvl w:val="0"/>
+          <w:numId w:val="16"/>
+        </w:numPr>
+      </w:pPr>
+      <w:r>
+        <w:t>Long-Term Outperformers</w:t>
+      </w:r>
+    </w:p>
+    <w:p>
+      <w:pPr>
+        <w:pStyle w:val="ListParagraph"/>
+        <w:numPr>
+          <w:ilvl w:val="0"/>
+          <w:numId w:val="17"/>
+        </w:numPr>
+      </w:pPr>
+      <w:r>
+        <w:t>CIGI.TO and CNR.TO: Stand out as leaders with exponential growth over the long term.</w:t>
+      </w:r>
+    </w:p>
+    <w:p>
+      <w:pPr>
+        <w:pStyle w:val="ListParagraph"/>
+        <w:numPr>
+          <w:ilvl w:val="0"/>
+          <w:numId w:val="17"/>
+        </w:numPr>
+      </w:pPr>
+      <w:r>
+        <w:t>Insight: These stocks likely belong to sectors benefiting from long-term structural growth trends.</w:t>
+      </w:r>
+    </w:p>
+    <w:p>
+      <w:pPr>
+        <w:pStyle w:val="ListParagraph"/>
+        <w:numPr>
+          <w:ilvl w:val="0"/>
+          <w:numId w:val="17"/>
+        </w:numPr>
+      </w:pPr>
+      <w:r>
+        <w:t>Customer Guidance: Highlight these stocks for long-term investors focused on capital appreciation.</w:t>
+      </w:r>
+    </w:p>
+    <w:p>
+      <w:pPr>
+        <w:pStyle w:val="ListParagraph"/>
+        <w:numPr>
+          <w:ilvl w:val="0"/>
+          <w:numId w:val="16"/>
+        </w:numPr>
+      </w:pPr>
+      <w:r>
+        <w:t>Risk vs. Stability</w:t>
+      </w:r>
+    </w:p>
+    <w:p>
+      <w:pPr>
+        <w:pStyle w:val="ListParagraph"/>
+        <w:numPr>
+          <w:ilvl w:val="0"/>
+          <w:numId w:val="18"/>
+        </w:numPr>
+      </w:pPr>
+      <w:r>
+        <w:t>High-Risk Tickers: BB.TO and ABX.TO demonstrate extreme volatility, which could yield high rewards or significant losses.</w:t>
+      </w:r>
+    </w:p>
+    <w:p>
+      <w:pPr>
+        <w:pStyle w:val="ListParagraph"/>
+        <w:numPr>
+          <w:ilvl w:val="1"/>
+          <w:numId w:val="18"/>
+        </w:numPr>
+      </w:pPr>
+      <w:r>
+        <w:t>Best suited for aggressive investors with high risk tolerance.</w:t>
+      </w:r>
+    </w:p>
+    <w:p>
+      <w:pPr>
+        <w:pStyle w:val="ListParagraph"/>
+        <w:numPr>
+          <w:ilvl w:val="0"/>
+          <w:numId w:val="18"/>
+        </w:numPr>
+      </w:pPr>
+      <w:r>
+        <w:t>Stable Growth Tickers: BCE.TO, BMO.TO, and ATD.TO offer steady returns, making them safer options for conservative investors.</w:t>
+      </w:r>
+    </w:p>
+    <w:p>
+      <w:pPr>
+        <w:pStyle w:val="ListParagraph"/>
+        <w:numPr>
+          <w:ilvl w:val="1"/>
+          <w:numId w:val="18"/>
+        </w:numPr>
+      </w:pPr>
+      <w:r>
+        <w:t>Recommend these for income-focused or risk-averse users.</w:t>
+      </w:r>
+    </w:p>
+    <w:p>
+      <w:pPr>
+        <w:pStyle w:val="ListParagraph"/>
+        <w:numPr>
+          <w:ilvl w:val="0"/>
+          <w:numId w:val="16"/>
+        </w:numPr>
+      </w:pPr>
+      <w:r>
+        <w:t>Highly Volatile Stocks</w:t>
+      </w:r>
+    </w:p>
+    <w:p>
+      <w:pPr>
+        <w:pStyle w:val="ListParagraph"/>
+        <w:numPr>
+          <w:ilvl w:val="0"/>
+          <w:numId w:val="19"/>
+        </w:numPr>
+      </w:pPr>
+      <w:r>
+        <w:t>BB.TO and ABX.TO: Exhibit significant fluctuations and periods of steep decline (e.g., during economic downturns like 2008 and 2020).</w:t>
+      </w:r>
+    </w:p>
+    <w:p>
+      <w:pPr>
+        <w:pStyle w:val="ListParagraph"/>
+        <w:numPr>
+          <w:ilvl w:val="1"/>
+          <w:numId w:val="19"/>
+        </w:numPr>
+      </w:pPr>
+      <w:r>
+        <w:t>Insight: These are likely in cyclical sectors (e.g., technology or mining), reacting strongly to market sentiment and macroeconomic factors.</w:t>
+      </w:r>
+    </w:p>
+    <w:p>
+      <w:pPr>
+        <w:pStyle w:val="ListParagraph"/>
+        <w:numPr>
+          <w:ilvl w:val="1"/>
+          <w:numId w:val="19"/>
+        </w:numPr>
+      </w:pPr>
+      <w:r>
+        <w:t>Customer Guidance: Recommend for short-term, high-risk investors or those tracking specific market trends (e.g., gold price fluctuations for ABX.TO).</w:t>
+      </w:r>
+    </w:p>
+    <w:p>
+      <w:pPr>
+        <w:pStyle w:val="ListParagraph"/>
+        <w:numPr>
+          <w:ilvl w:val="0"/>
+          <w:numId w:val="16"/>
+        </w:numPr>
+      </w:pPr>
+      <w:r>
+        <w:t>Strong Performers</w:t>
+      </w:r>
+    </w:p>
+    <w:p>
+      <w:pPr>
+        <w:pStyle w:val="ListParagraph"/>
+        <w:numPr>
+          <w:ilvl w:val="0"/>
+          <w:numId w:val="19"/>
+        </w:numPr>
+      </w:pPr>
+      <w:r>
+        <w:t>CIGI.TO: Exhibits significant price growth, especially after 2016, indicating consistent upward momentum and strong sector performance (possibly real estate or growth-focused).</w:t>
+      </w:r>
+    </w:p>
+    <w:p>
+      <w:pPr>
+        <w:pStyle w:val="ListParagraph"/>
+        <w:numPr>
+          <w:ilvl w:val="1"/>
+          <w:numId w:val="19"/>
+        </w:numPr>
+      </w:pPr>
+      <w:r>
+        <w:t>Insight: Suitable for investors seeking high-growth stocks.</w:t>
+      </w:r>
+    </w:p>
+    <w:p>
+      <w:pPr>
+        <w:pStyle w:val="ListParagraph"/>
+        <w:numPr>
+          <w:ilvl w:val="0"/>
+          <w:numId w:val="19"/>
+        </w:numPr>
+      </w:pPr>
+      <w:r>
+        <w:t>CNR.TO and BMO.TO: Show stable and consistent growth over the years, indicating resilience and potential for long-term investments.</w:t>
+      </w:r>
+    </w:p>
+    <w:p>
+      <w:pPr>
+        <w:pStyle w:val="ListParagraph"/>
+        <w:numPr>
+          <w:ilvl w:val="1"/>
+          <w:numId w:val="19"/>
+        </w:numPr>
+      </w:pPr>
+      <w:r>
+        <w:t>Insight: Ideal for investors with moderate risk tolerance aiming for steady growth.</w:t>
+      </w:r>
+    </w:p>
+    <w:p>
+      <w:pPr>
+        <w:rPr>
+          <w:b/>
+          <w:bCs/>
+        </w:rPr>
+      </w:pPr>
+      <w:r>
+        <w:rPr>
+          <w:b/>
+          <w:bCs/>
+        </w:rPr>
+        <w:t>Sector Analysis and Connections</w:t>
+      </w:r>
+    </w:p>
+    <w:p>
+      <w:pPr>
+        <w:numPr>
+          <w:ilvl w:val="0"/>
+          <w:numId w:val="20"/>
+        </w:numPr>
+      </w:pPr>
+      <w:r>
+        <w:rPr>
+          <w:b/>
+          <w:bCs/>
+        </w:rPr>
+        <w:lastRenderedPageBreak/>
+        <w:t>Financial Sector (e.g., BMO.TO)</w:t>
+      </w:r>
+    </w:p>
+    <w:p>
+      <w:pPr>
+        <w:numPr>
+          <w:ilvl w:val="1"/>
+          <w:numId w:val="20"/>
+        </w:numPr>
+      </w:pPr>
+      <w:r>
+        <w:rPr>
+          <w:b/>
+          <w:bCs/>
+        </w:rPr>
+        <w:t>Connection to Energy</w:t>
+      </w:r>
+      <w:r>
+        <w:t>:</w:t>
+      </w:r>
+      <w:r>
+        <w:br/>
+        <w:t>Financial institutions are often exposed to the energy sector through lending and investments. A downturn in energy prices (affecting stocks like CNQ.TO) can lead to increased loan defaults or reduced profits for banks.</w:t>
+      </w:r>
+    </w:p>
+    <w:p>
+      <w:pPr>
+        <w:numPr>
+          <w:ilvl w:val="1"/>
+          <w:numId w:val="20"/>
+        </w:numPr>
+      </w:pPr>
+      <w:r>
+        <w:rPr>
+          <w:b/>
+          <w:bCs/>
+        </w:rPr>
+        <w:t>Connection to Real Estate</w:t>
+      </w:r>
+      <w:r>
+        <w:t>:</w:t>
+      </w:r>
+      <w:r>
+        <w:br/>
+        <w:t>Financial health influences real estate investment activities. A positive outlook in financials may lead to growth in real estate sectors like CIGI.TO.</w:t>
+      </w:r>
+    </w:p>
+    <w:p>
+      <w:pPr>
+        <w:numPr>
+          <w:ilvl w:val="0"/>
+          <w:numId w:val="20"/>
+        </w:numPr>
+      </w:pPr>
+      <w:r>
+        <w:rPr>
+          <w:b/>
+          <w:bCs/>
+        </w:rPr>
+        <w:t>Energy Sector (e.g., CNQ.TO)</w:t>
+      </w:r>
+    </w:p>
+    <w:p>
+      <w:pPr>
+        <w:numPr>
+          <w:ilvl w:val="1"/>
+          <w:numId w:val="20"/>
+        </w:numPr>
+      </w:pPr>
+      <w:r>
+        <w:rPr>
+          <w:b/>
+          <w:bCs/>
+        </w:rPr>
+        <w:t>Connection to Industrial</w:t>
+      </w:r>
+      <w:r>
+        <w:t>:</w:t>
+      </w:r>
+      <w:r>
+        <w:br/>
+        <w:t>Energy prices directly affect operational costs in the industrial sector (e.g., CNR.TO). Rising energy prices may reduce profit margins for industrial companies.</w:t>
+      </w:r>
+    </w:p>
+    <w:p>
+      <w:pPr>
+        <w:numPr>
+          <w:ilvl w:val="1"/>
+          <w:numId w:val="20"/>
+        </w:numPr>
+      </w:pPr>
+      <w:r>
+        <w:rPr>
+          <w:b/>
+          <w:bCs/>
+        </w:rPr>
+        <w:t>Connection to Consumer Staples</w:t>
+      </w:r>
+      <w:r>
+        <w:t>:</w:t>
+      </w:r>
+      <w:r>
+        <w:br/>
+        <w:t>High energy prices often lead to increased transportation and production costs, indirectly raising prices for consumer goods (e.g., ATD.TO).</w:t>
+      </w:r>
+    </w:p>
+    <w:p>
+      <w:pPr>
+        <w:numPr>
+          <w:ilvl w:val="0"/>
+          <w:numId w:val="20"/>
+        </w:numPr>
+      </w:pPr>
+      <w:r>
+        <w:rPr>
+          <w:b/>
+          <w:bCs/>
+        </w:rPr>
+        <w:t>Industrial Sector (e.g., CNR.TO)</w:t>
+      </w:r>
+    </w:p>
+    <w:p>
+      <w:pPr>
+        <w:numPr>
+          <w:ilvl w:val="1"/>
+          <w:numId w:val="20"/>
+        </w:numPr>
+      </w:pPr>
+      <w:r>
+        <w:rPr>
+          <w:b/>
+          <w:bCs/>
+        </w:rPr>
+        <w:t>Connection to Consumer Discretionary</w:t>
+      </w:r>
+      <w:r>
+        <w:t>:</w:t>
+      </w:r>
+      <w:r>
+        <w:br/>
+        <w:t>As industrial activity increases, transportation and logistics costs (affected by stocks like CNR.TO) can impact discretionary spending by consumers.</w:t>
+      </w:r>
+    </w:p>
+    <w:p>
+      <w:pPr>
+        <w:numPr>
+          <w:ilvl w:val="0"/>
+          <w:numId w:val="20"/>
+        </w:numPr>
+      </w:pPr>
+      <w:r>
+        <w:rPr>
+          <w:b/>
+          <w:bCs/>
+        </w:rPr>
+        <w:t>Gold &amp; Mining Sector (e.g., ABX.TO)</w:t>
+      </w:r>
+    </w:p>
+    <w:p>
+      <w:pPr>
+        <w:numPr>
+          <w:ilvl w:val="1"/>
+          <w:numId w:val="20"/>
+        </w:numPr>
+      </w:pPr>
+      <w:r>
+        <w:rPr>
+          <w:b/>
+          <w:bCs/>
+        </w:rPr>
+        <w:t>Connection to Financials</w:t>
+      </w:r>
+      <w:r>
+        <w:t>:</w:t>
+      </w:r>
+      <w:r>
+        <w:br/>
+        <w:t>Gold prices often rise during economic uncertainty, leading to reduced confidence in financial stocks. Investors tend to shift from financial instruments to safe-haven investments like gold.</w:t>
+      </w:r>
+    </w:p>
+    <w:p>
+      <w:pPr>
+        <w:numPr>
+          <w:ilvl w:val="1"/>
+          <w:numId w:val="20"/>
+        </w:numPr>
+      </w:pPr>
+      <w:r>
+        <w:rPr>
+          <w:b/>
+          <w:bCs/>
+        </w:rPr>
+        <w:t>Inverse Relationship to Growth Sectors</w:t>
+      </w:r>
+      <w:r>
+        <w:t>:</w:t>
+      </w:r>
+      <w:r>
+        <w:br/>
+        <w:t>Gold typically performs well during downturns, while growth sectors (e.g., tech like BB.TO) may underperform.</w:t>
+      </w:r>
+    </w:p>
+    <w:p>
+      <w:pPr>
+        <w:numPr>
+          <w:ilvl w:val="0"/>
+          <w:numId w:val="20"/>
+        </w:numPr>
+      </w:pPr>
+      <w:r>
+        <w:rPr>
+          <w:b/>
+          <w:bCs/>
+        </w:rPr>
+        <w:t>Technology Sector (e.g., BB.TO)</w:t>
+      </w:r>
+    </w:p>
+    <w:p>
+      <w:pPr>
+        <w:numPr>
+          <w:ilvl w:val="1"/>
+          <w:numId w:val="20"/>
+        </w:numPr>
+      </w:pPr>
+      <w:r>
+        <w:rPr>
+          <w:b/>
+          <w:bCs/>
+        </w:rPr>
+        <w:t>Connection to Financials</w:t>
+      </w:r>
+      <w:r>
+        <w:t>:</w:t>
+      </w:r>
+      <w:r>
+        <w:br/>
+        <w:t xml:space="preserve">Technology companies rely on funding and capital from financial </w:t>
+      </w:r>
+      <w:r>
+        <w:lastRenderedPageBreak/>
+        <w:t>institutions. If financials are under stress, investment in tech companies may slow down.</w:t>
+      </w:r>
+    </w:p>
+    <w:p>
+      <w:pPr>
+        <w:numPr>
+          <w:ilvl w:val="1"/>
+          <w:numId w:val="20"/>
+        </w:numPr>
+      </w:pPr>
+      <w:r>
+        <w:rPr>
+          <w:b/>
+          <w:bCs/>
+        </w:rPr>
+        <w:t>Connection to Consumer Spending</w:t>
+      </w:r>
+      <w:r>
+        <w:t>:</w:t>
+      </w:r>
+      <w:r>
+        <w:br/>
+        <w:t>Tech adoption is closely tied to consumer discretionary spending. Economic stress (affecting consumer staples) can reduce demand for technology.</w:t>
+      </w:r>
+    </w:p>
+    <w:p>
+      <w:pPr>
+        <w:numPr>
+          <w:ilvl w:val="0"/>
+          <w:numId w:val="20"/>
+        </w:numPr>
+      </w:pPr>
+      <w:r>
+        <w:rPr>
+          <w:b/>
+          <w:bCs/>
+        </w:rPr>
+        <w:t>Consumer Staples (e.g., ATD.TO)</w:t>
+      </w:r>
+    </w:p>
+    <w:p>
+      <w:pPr>
+        <w:numPr>
+          <w:ilvl w:val="1"/>
+          <w:numId w:val="20"/>
+        </w:numPr>
+      </w:pPr>
+      <w:r>
+        <w:rPr>
+          <w:b/>
+          <w:bCs/>
+        </w:rPr>
+        <w:t>Connection to Industrial and Energy</w:t>
+      </w:r>
+      <w:r>
+        <w:t>:</w:t>
+      </w:r>
+      <w:r>
+        <w:br/>
+        <w:t>Rising industrial and energy costs can reduce profit margins for consumer staple companies as raw material and logistics expenses increase.</w:t>
+      </w:r>
+    </w:p>
+    <w:p>
+      <w:pPr>
+        <w:numPr>
+          <w:ilvl w:val="1"/>
+          <w:numId w:val="20"/>
+        </w:numPr>
+      </w:pPr>
+      <w:r>
+        <w:rPr>
+          <w:b/>
+          <w:bCs/>
+        </w:rPr>
+        <w:t>Connection to Gold</w:t>
+      </w:r>
+      <w:r>
+        <w:t>:</w:t>
+      </w:r>
+      <w:r>
+        <w:br/>
+        <w:t>Consumer staples and gold often perform well during downturns, as they represent stability and essential goods.</w:t>
+      </w:r>
+    </w:p>
+    <w:p>
+      <w:pPr>
+        <w:numPr>
+          <w:ilvl w:val="0"/>
+          <w:numId w:val="20"/>
+        </w:numPr>
+      </w:pPr>
+      <w:r>
+        <w:rPr>
+          <w:b/>
+          <w:bCs/>
+        </w:rPr>
+        <w:t>Real Estate Sector (e.g., CIGI.TO)</w:t>
+      </w:r>
+    </w:p>
+    <w:p>
+      <w:pPr>
+        <w:numPr>
+          <w:ilvl w:val="1"/>
+          <w:numId w:val="20"/>
+        </w:numPr>
+      </w:pPr>
+      <w:r>
+        <w:rPr>
+          <w:b/>
+          <w:bCs/>
+        </w:rPr>
+        <w:t>Connection to Financials</w:t>
+      </w:r>
+      <w:r>
+        <w:t>:</w:t>
+      </w:r>
+      <w:r>
+        <w:br/>
+        <w:t>Real estate activity is heavily dependent on the financial sector's lending environment. High interest rates can reduce borrowing and hurt real estate investments.</w:t>
+      </w:r>
+    </w:p>
+    <w:p>
+      <w:pPr>
+        <w:rPr>
+          <w:b/>
+          <w:bCs/>
+        </w:rPr>
+      </w:pPr>
+      <w:r>
+        <w:rPr>
+          <w:b/>
+          <w:bCs/>
+        </w:rPr>
+        <w:t>Insights for the Investor</w:t>
+      </w:r>
+    </w:p>
+    <w:p>
+      <w:pPr>
+        <w:numPr>
+          <w:ilvl w:val="0"/>
+          <w:numId w:val="21"/>
+        </w:numPr>
+      </w:pPr>
+      <w:r>
+        <w:rPr>
+          <w:b/>
+          <w:bCs/>
+        </w:rPr>
+        <w:t>Energy as a Catalyst</w:t>
+      </w:r>
+      <w:r>
+        <w:t>: Changes in energy prices can have ripple effects across financials, industrials, and consumer staples. Investors should monitor energy sector performance to anticipate broader market impacts.</w:t>
+      </w:r>
+    </w:p>
+    <w:p>
+      <w:pPr>
+        <w:numPr>
+          <w:ilvl w:val="0"/>
+          <w:numId w:val="21"/>
+        </w:numPr>
+      </w:pPr>
+      <w:r>
+        <w:rPr>
+          <w:b/>
+          <w:bCs/>
+        </w:rPr>
+        <w:t>Gold as a Hedge</w:t>
+      </w:r>
+      <w:r>
+        <w:t>: Gold is negatively correlated with growth and financial sectors. It is a reliable hedge during market volatility.</w:t>
+      </w:r>
+    </w:p>
+    <w:p>
+      <w:pPr>
+        <w:numPr>
+          <w:ilvl w:val="0"/>
+          <w:numId w:val="21"/>
+        </w:numPr>
+      </w:pPr>
+      <w:r>
+        <w:rPr>
+          <w:b/>
+          <w:bCs/>
+        </w:rPr>
+        <w:t>Sector Synergies</w:t>
+      </w:r>
+      <w:r>
+        <w:t>:</w:t>
+      </w:r>
+    </w:p>
+    <w:p>
+      <w:pPr>
+        <w:numPr>
+          <w:ilvl w:val="1"/>
+          <w:numId w:val="21"/>
+        </w:numPr>
+      </w:pPr>
+      <w:r>
+        <w:t>Financials and real estate are closely linked; growth in one often supports the other.</w:t>
+      </w:r>
+    </w:p>
+    <w:p>
+      <w:pPr>
+        <w:numPr>
+          <w:ilvl w:val="1"/>
+          <w:numId w:val="21"/>
+        </w:numPr>
+      </w:pPr>
+      <w:r>
+        <w:t>Industrials and energy share a direct cost relationship; rising energy prices can reduce industrial profits.</w:t>
+      </w:r>
+    </w:p>
+    <w:p>
+      <w:pPr>
+        <w:numPr>
+          <w:ilvl w:val="0"/>
+          <w:numId w:val="21"/>
+        </w:numPr>
+      </w:pPr>
+      <w:r>
+        <w:rPr>
+          <w:b/>
+          <w:bCs/>
+        </w:rPr>
+        <w:t>Portfolio Diversification</w:t>
+      </w:r>
+      <w:r>
+        <w:t>: Ensure exposure across unrelated sectors (e.g., financials, gold, and consumer staples) to minimize risks from sector-specific downturns.</w:t>
+      </w:r>
+      <w:r>
+        <w:br/>
       </w:r>
     </w:p>
     <w:bookmarkEnd w:id="0"/>

</xml_diff>